<commit_message>
Make the exact-row overflow case independent of clipped text extraction
The overflowing content was a second text line. Chromium's PDF writer
drops glyphs that lie entirely outside a clip, so a correctly clipped
row's text layer held fragments of that line while LibreOffice keeps the
whole line, and the visible-token inventory measured text-layer behaviour
rather than the row-height rule. The cell now ends with an empty 36pt
paragraph mark: the row still needs more than its exact 18pt, and the
Birch03 position check judges whether the rule held.

Refs #31
</commit_message>
<xml_diff>
--- a/fixtures/tables-row-height-exact-overflow.docx
+++ b/fixtures/tables-row-height-exact-overflow.docx
@@ -72,11 +72,10 @@
           <w:p>
             <w:pPr>
               <w:spacing w:after="0"/>
+              <w:rPr>
+                <w:sz w:val="72"/>
+              </w:rPr>
             </w:pPr>
-            <w:r>
-              <w:rPr/>
-              <w:t xml:space="preserve">Overflow Birch continuation line.</w:t>
-            </w:r>
           </w:p>
         </w:tc>
         <w:tc>

</xml_diff>